<commit_message>
release: prepare Barracuda 4.1.0
</commit_message>
<xml_diff>
--- a/Anleitung/anleitung.docx
+++ b/Anleitung/anleitung.docx
@@ -649,97 +649,7 @@
           <w:szCs w:val="20"/>
           <w:lang w:val="de-DE"/>
         </w:rPr>
-        <w:t xml:space="preserve">Warten Sie den automatischen Wählvorgang vollständig ab. </w:t>
-      </w:r>
-    </w:p>
-    <w:p>
-      <w:pPr>
-        <w:pStyle w:val="Listenabsatz"/>
-        <w:numPr>
-          <w:ilvl w:val="0"/>
-          <w:numId w:val="1"/>
-        </w:numPr>
-        <w:shd w:val="clear" w:color="auto" w:fill="FFCCCC"/>
-        <w:spacing w:before="150" w:after="300"/>
-        <w:divId w:val="1327978712"/>
-        <w:rPr>
-          <w:rFonts w:ascii="Segoe UI" w:eastAsia="Times New Roman" w:hAnsi="Segoe UI" w:cs="Segoe UI"/>
-          <w:b/>
-          <w:bCs/>
-          <w:color w:val="A80000"/>
-          <w:sz w:val="20"/>
-          <w:szCs w:val="20"/>
-          <w:lang w:val="de-DE"/>
-        </w:rPr>
-      </w:pPr>
-      <w:r>
-        <w:rPr>
-          <w:rFonts w:ascii="Segoe UI" w:eastAsia="Times New Roman" w:hAnsi="Segoe UI" w:cs="Segoe UI"/>
-          <w:b/>
-          <w:bCs/>
-          <w:color w:val="A80000"/>
-          <w:sz w:val="20"/>
-          <w:szCs w:val="20"/>
-          <w:lang w:val="de-DE"/>
-        </w:rPr>
-        <w:t>Nach dem</w:t>
-      </w:r>
-      <w:r>
-        <w:rPr>
-          <w:rFonts w:ascii="Segoe UI" w:eastAsia="Times New Roman" w:hAnsi="Segoe UI" w:cs="Segoe UI"/>
-          <w:b/>
-          <w:bCs/>
-          <w:color w:val="A80000"/>
-          <w:sz w:val="20"/>
-          <w:szCs w:val="20"/>
-          <w:lang w:val="de-DE"/>
-        </w:rPr>
-        <w:t xml:space="preserve"> Wählvorgangs erhalten Sie eine </w:t>
-      </w:r>
-      <w:r>
-        <w:rPr>
-          <w:rFonts w:ascii="Segoe UI" w:eastAsia="Times New Roman" w:hAnsi="Segoe UI" w:cs="Segoe UI"/>
-          <w:b/>
-          <w:bCs/>
-          <w:color w:val="A80000"/>
-          <w:sz w:val="20"/>
-          <w:szCs w:val="20"/>
-          <w:lang w:val="de-DE"/>
-        </w:rPr>
-        <w:t xml:space="preserve">akustische Rückmeldung über den Erfolg der Rufumleitung. </w:t>
-      </w:r>
-    </w:p>
-    <w:p>
-      <w:pPr>
-        <w:pStyle w:val="Listenabsatz"/>
-        <w:numPr>
-          <w:ilvl w:val="0"/>
-          <w:numId w:val="1"/>
-        </w:numPr>
-        <w:shd w:val="clear" w:color="auto" w:fill="FFCCCC"/>
-        <w:spacing w:before="150" w:after="300"/>
-        <w:divId w:val="1327978712"/>
-        <w:rPr>
-          <w:rFonts w:ascii="Segoe UI" w:eastAsia="Times New Roman" w:hAnsi="Segoe UI" w:cs="Segoe UI"/>
-          <w:b/>
-          <w:bCs/>
-          <w:color w:val="A80000"/>
-          <w:sz w:val="20"/>
-          <w:szCs w:val="20"/>
-          <w:lang w:val="de-DE"/>
-        </w:rPr>
-      </w:pPr>
-      <w:r>
-        <w:rPr>
-          <w:rFonts w:ascii="Segoe UI" w:eastAsia="Times New Roman" w:hAnsi="Segoe UI" w:cs="Segoe UI"/>
-          <w:b/>
-          <w:bCs/>
-          <w:color w:val="A80000"/>
-          <w:sz w:val="20"/>
-          <w:szCs w:val="20"/>
-          <w:lang w:val="de-DE"/>
-        </w:rPr>
-        <w:t xml:space="preserve">Die App kehrt danach automatisch zum Hauptbildschirm zurück. </w:t>
+        <w:t xml:space="preserve">Bei A1 hören Sie die Netzansage; bei generischen #-Codes wird die USSD-Antwort verarbeitet. Der Ablauf wird automatisch fortgesetzt. Nur Fehler melden.</w:t>
       </w:r>
     </w:p>
     <w:p>
@@ -794,42 +704,7 @@
           <w:szCs w:val="21"/>
           <w:lang w:val="de-DE"/>
         </w:rPr>
-        <w:t xml:space="preserve">Um alle Weiterleitungen zu beenden, tippen Sie einfach auf die rote </w:t>
-      </w:r>
-      <w:r>
-        <w:rPr>
-          <w:rStyle w:val="HTMLCode"/>
-          <w:color w:val="333333"/>
-          <w:lang w:val="de-DE"/>
-        </w:rPr>
-        <w:t>Deakt</w:t>
-      </w:r>
-      <w:r>
-        <w:rPr>
-          <w:rStyle w:val="HTMLCode"/>
-          <w:color w:val="333333"/>
-          <w:lang w:val="de-DE"/>
-        </w:rPr>
-        <w:t>ivieren</w:t>
-      </w:r>
-      <w:r>
-        <w:rPr>
-          <w:rFonts w:ascii="Segoe UI" w:eastAsia="Times New Roman" w:hAnsi="Segoe UI" w:cs="Segoe UI"/>
-          <w:color w:val="333333"/>
-          <w:sz w:val="21"/>
-          <w:szCs w:val="21"/>
-          <w:lang w:val="de-DE"/>
-        </w:rPr>
-        <w:t xml:space="preserve"> Schaltfläche auf dem Hauptbildschirm. </w:t>
-      </w:r>
-      <w:r>
-        <w:rPr>
-          <w:rFonts w:ascii="Segoe UI" w:eastAsia="Times New Roman" w:hAnsi="Segoe UI" w:cs="Segoe UI"/>
-          <w:color w:val="333333"/>
-          <w:sz w:val="21"/>
-          <w:szCs w:val="21"/>
-        </w:rPr>
-        <w:t>Wählvorgang abwarten. App kehrt automatisch zum Hauptbildschirm zurück.</w:t>
+        <w:t xml:space="preserve">Um alle Weiterleitungen zu beenden, tippen Sie auf die rote Deaktivieren-Schaltfläche auf dem Hauptbildschirm. Warten Sie die Rückmeldung des Mobilfunkanbieters ab.</w:t>
       </w:r>
     </w:p>
     <w:p>
@@ -873,17 +748,7 @@
           <w:szCs w:val="20"/>
           <w:lang w:val="de-DE"/>
         </w:rPr>
-        <w:t xml:space="preserve">Die App leitet Anrufe nicht selbst um. Sie sendet nur einen </w:t>
-      </w:r>
-      <w:r>
-        <w:rPr>
-          <w:rFonts w:ascii="Segoe UI" w:eastAsia="Times New Roman" w:hAnsi="Segoe UI" w:cs="Segoe UI"/>
-          <w:color w:val="333333"/>
-          <w:sz w:val="20"/>
-          <w:szCs w:val="20"/>
-          <w:lang w:val="de-DE"/>
-        </w:rPr>
-        <w:t xml:space="preserve">Steuercode (MMI-Code) an Ihren Mobilfunkanbieter. Die eigentliche Umleitung findet im Netz des Anbieters statt. </w:t>
+        <w:t xml:space="preserve">Die App leitet Anrufe nicht selbst um. Sie übergibt einen konfigurierten MMI-/USSD-Code an Ihren Mobilfunkanbieter. Bei A1 wird dieser als Sprach-MMI-Telefonat ausgeführt; die Ansage kann Android nicht maschinell auswerten. Die eigentliche Umleitung findet ausschließlich im Netz des Anbieters statt.</w:t>
       </w:r>
     </w:p>
     <w:p>
@@ -1222,25 +1087,7 @@
                 <w:sz w:val="21"/>
                 <w:szCs w:val="21"/>
               </w:rPr>
-              <w:t>Fragt den aktuellen Status der Rufumleitung beim Netzbetreiber ab und gibt akustisches Feedback</w:t>
-            </w:r>
-            <w:r>
-              <w:rPr>
-                <w:rFonts w:ascii="Segoe UI" w:eastAsia="Times New Roman" w:hAnsi="Segoe UI" w:cs="Segoe UI"/>
-                <w:color w:val="333333"/>
-                <w:sz w:val="21"/>
-                <w:szCs w:val="21"/>
-              </w:rPr>
-              <w:t>. Wählvorgang abwarten. App kehrt automatisch zum Hauptbildschirm zurück</w:t>
-            </w:r>
-            <w:r>
-              <w:rPr>
-                <w:rFonts w:ascii="Segoe UI" w:eastAsia="Times New Roman" w:hAnsi="Segoe UI" w:cs="Segoe UI"/>
-                <w:color w:val="333333"/>
-                <w:sz w:val="21"/>
-                <w:szCs w:val="21"/>
-              </w:rPr>
-              <w:t>.</w:t>
+              <w:t>Fragt den aktuellen Status der Rufumleitung beim Netzbetreiber ab, ohne etwas zu ändern. Je nach Anbieter kommt eine USSD-Antwort oder eine hörbare Netzansage.</w:t>
             </w:r>
           </w:p>
         </w:tc>
@@ -1390,25 +1237,7 @@
                 <w:sz w:val="21"/>
                 <w:szCs w:val="21"/>
               </w:rPr>
-              <w:t>Setzt alle Einstellungen auf Standard (deaktiviert) zurück, falls sich die App unerwartet verhält.</w:t>
-            </w:r>
-            <w:r>
-              <w:rPr>
-                <w:rFonts w:ascii="Segoe UI" w:eastAsia="Times New Roman" w:hAnsi="Segoe UI" w:cs="Segoe UI"/>
-                <w:color w:val="333333"/>
-                <w:sz w:val="21"/>
-                <w:szCs w:val="21"/>
-              </w:rPr>
-              <w:t xml:space="preserve"> </w:t>
-            </w:r>
-            <w:r>
-              <w:rPr>
-                <w:rFonts w:ascii="Segoe UI" w:eastAsia="Times New Roman" w:hAnsi="Segoe UI" w:cs="Segoe UI"/>
-                <w:color w:val="333333"/>
-                <w:sz w:val="21"/>
-                <w:szCs w:val="21"/>
-              </w:rPr>
-              <w:t>Wählvorgang abwarten. App kehrt automatisch zum Hauptbildschirm zurück.</w:t>
+              <w:t>Setzt lokale Einstellungen zurück; bestehende Rufumleitungen bleiben unverändert.</w:t>
             </w:r>
           </w:p>
         </w:tc>

</xml_diff>